<commit_message>
Emlak headless render (Playwright) + rapora ekran görüntüleri
- scraper.render_page: JS-SPA için Playwright render, graceful fallback
- live.py: render_required kaynakta httpx ince ise headless render dener
- Rapora masaüstü+mobil dashboard ekran görüntüleri gömüldü
- 6/6 banka artık canlı (Emlak dahil)

Co-Authored-By: Claude Opus 4.8 <noreply@anthropic.com>
</commit_message>
<xml_diff>
--- a/teknofest/rapor/KatilimLens_On_Degerlendirme_Raporu.docx
+++ b/teknofest/rapor/KatilimLens_On_Degerlendirme_Raporu.docx
@@ -3498,7 +3498,7 @@
               <w:rPr>
                 <w:sz w:val="20"/>
               </w:rPr>
-              <w:t>JS-SPA → fallback</w:t>
+              <w:t>CANLI (headless render)</w:t>
             </w:r>
           </w:p>
         </w:tc>
@@ -3513,7 +3513,7 @@
               <w:rPr>
                 <w:sz w:val="20"/>
               </w:rPr>
-              <w:t>httpx içerik vermez; örnek-fallback (headless yol haritasında)</w:t>
+              <w:t>JS-SPA; Playwright ile render edilerek ürün listesi alındı</w:t>
             </w:r>
           </w:p>
         </w:tc>
@@ -3530,7 +3530,7 @@
           <w:color w:val="555F70"/>
           <w:sz w:val="18"/>
         </w:rPr>
-        <w:t>Sonuç: 6 bankadan 5'i sunucu-tarafı içerik döndürdü ve canlı işlendi; başarısızlık olmadı. Kuveyt Türk için kâr paylaşım oranı tablodan yapısal ve grounding'li çıkarıldı.</w:t>
+        <w:t>Sonuç: 6 katılım bankasının TAMAMI canlı işlendi (5'i doğrudan httpx, 1'i Playwright headless render ile); başarısızlık olmadı. Kuveyt Türk'te kâr paylaşım oranı tablodan, Vakıf'ta brüt oran div'den yapısal ve grounding'li çıkarıldı.</w:t>
       </w:r>
     </w:p>
     <w:p>
@@ -3588,32 +3588,107 @@
     </w:p>
     <w:p>
       <w:pPr>
-        <w:spacing w:after="120"/>
+        <w:jc w:val="center"/>
+      </w:pPr>
+      <w:r>
+        <w:drawing>
+          <wp:inline xmlns:a="http://schemas.openxmlformats.org/drawingml/2006/main" xmlns:pic="http://schemas.openxmlformats.org/drawingml/2006/picture">
+            <wp:extent cx="5760720" cy="4096512"/>
+            <wp:docPr id="1" name="Picture 1"/>
+            <wp:cNvGraphicFramePr>
+              <a:graphicFrameLocks noChangeAspect="1"/>
+            </wp:cNvGraphicFramePr>
+            <a:graphic>
+              <a:graphicData uri="http://schemas.openxmlformats.org/drawingml/2006/picture">
+                <pic:pic>
+                  <pic:nvPicPr>
+                    <pic:cNvPr id="0" name="dashboard_masaustu.png"/>
+                    <pic:cNvPicPr/>
+                  </pic:nvPicPr>
+                  <pic:blipFill>
+                    <a:blip r:embed="rId9"/>
+                    <a:stretch>
+                      <a:fillRect/>
+                    </a:stretch>
+                  </pic:blipFill>
+                  <pic:spPr>
+                    <a:xfrm>
+                      <a:off x="0" y="0"/>
+                      <a:ext cx="5760720" cy="4096512"/>
+                    </a:xfrm>
+                    <a:prstGeom prst="rect"/>
+                  </pic:spPr>
+                </pic:pic>
+              </a:graphicData>
+            </a:graphic>
+          </wp:inline>
+        </w:drawing>
+      </w:r>
+    </w:p>
+    <w:p>
+      <w:pPr>
         <w:jc w:val="center"/>
       </w:pPr>
       <w:r>
         <w:rPr>
-          <w:b w:val="0"/>
           <w:i/>
           <w:color w:val="555F70"/>
-          <w:sz w:val="22"/>
+          <w:sz w:val="18"/>
         </w:rPr>
-        <w:t>[BURAYA EKRAN GÖRÜNTÜSÜ EKLEYİN — masaüstü dashboard]</w:t>
+        <w:t>Şekil 1. Masaüstü dashboard — özet kartları (Çıkarım F1 %100), CANLI/örnek rozetli karşılaştırma tablosu, kâr paylaşım oranı (📊 90-10), akıllı asistan ve doğruluk paneli.</w:t>
+      </w:r>
+    </w:p>
+    <w:p/>
+    <w:p>
+      <w:pPr>
+        <w:jc w:val="center"/>
+      </w:pPr>
+      <w:r>
+        <w:drawing>
+          <wp:inline xmlns:a="http://schemas.openxmlformats.org/drawingml/2006/main" xmlns:pic="http://schemas.openxmlformats.org/drawingml/2006/picture">
+            <wp:extent cx="2468880" cy="5342910"/>
+            <wp:docPr id="2" name="Picture 2"/>
+            <wp:cNvGraphicFramePr>
+              <a:graphicFrameLocks noChangeAspect="1"/>
+            </wp:cNvGraphicFramePr>
+            <a:graphic>
+              <a:graphicData uri="http://schemas.openxmlformats.org/drawingml/2006/picture">
+                <pic:pic>
+                  <pic:nvPicPr>
+                    <pic:cNvPr id="0" name="dashboard_mobil.png"/>
+                    <pic:cNvPicPr/>
+                  </pic:nvPicPr>
+                  <pic:blipFill>
+                    <a:blip r:embed="rId10"/>
+                    <a:stretch>
+                      <a:fillRect/>
+                    </a:stretch>
+                  </pic:blipFill>
+                  <pic:spPr>
+                    <a:xfrm>
+                      <a:off x="0" y="0"/>
+                      <a:ext cx="2468880" cy="5342910"/>
+                    </a:xfrm>
+                    <a:prstGeom prst="rect"/>
+                  </pic:spPr>
+                </pic:pic>
+              </a:graphicData>
+            </a:graphic>
+          </wp:inline>
+        </w:drawing>
       </w:r>
     </w:p>
     <w:p>
       <w:pPr>
-        <w:spacing w:after="120"/>
         <w:jc w:val="center"/>
       </w:pPr>
       <w:r>
         <w:rPr>
-          <w:b w:val="0"/>
           <w:i/>
           <w:color w:val="555F70"/>
-          <w:sz w:val="22"/>
+          <w:sz w:val="18"/>
         </w:rPr>
-        <w:t>[BURAYA EKRAN GÖRÜNTÜSÜ EKLEYİN — mobil kart görünümü + sohbet]</w:t>
+        <w:t>Şekil 2. Mobil görünüm — karşılaştırma tablosu otomatik kart görünümüne geçer; her ürün etiketli alanlarla ve kaynak rozetiyle listelenir.</w:t>
       </w:r>
     </w:p>
     <w:p>

</xml_diff>